<commit_message>
feat: elevate online report showcase into single source of truth incident portal
</commit_message>
<xml_diff>
--- a/Draft_Versions/2026-09-13/PFPJ_Minab_Factual_Determination_Main_Report_2026-09-13_Draft.docx
+++ b/Draft_Versions/2026-09-13/PFPJ_Minab_Factual_Determination_Main_Report_2026-09-13_Draft.docx
@@ -1648,24 +1648,7 @@
           <w:color w:val="1E293B"/>
           <w:sz w:val="19"/>
         </w:rPr>
-        <w:t xml:space="preserve">The primary objective of this report is </w:t>
-      </w:r>
-      <w:r>
-        <w:rPr>
-          <w:rFonts w:ascii="Calibri" w:hAnsi="Calibri"/>
-          <w:b/>
-          <w:color w:val="1E293B"/>
-          <w:sz w:val="19"/>
-        </w:rPr>
-        <w:t>not</w:t>
-      </w:r>
-      <w:r>
-        <w:rPr>
-          <w:rFonts w:ascii="Calibri" w:hAnsi="Calibri"/>
-          <w:color w:val="1E293B"/>
-          <w:sz w:val="19"/>
-        </w:rPr>
-        <w:t xml:space="preserve"> the immediate lodging of an individual criminal trial indictment against tactical service-members. Rather, its immediate institutional purpose is:</w:t>
+        <w:t>This report serves four institutional purposes:</w:t>
       </w:r>
     </w:p>
     <w:p>
@@ -1680,24 +1663,7 @@
           <w:color w:val="1E293B"/>
           <w:sz w:val="19"/>
         </w:rPr>
-        <w:t xml:space="preserve">(i) To establish an immutable, court-ready </w:t>
-      </w:r>
-      <w:r>
-        <w:rPr>
-          <w:rFonts w:ascii="Calibri" w:hAnsi="Calibri"/>
-          <w:b/>
-          <w:color w:val="1E293B"/>
-          <w:sz w:val="19"/>
-        </w:rPr>
-        <w:t>factual determination</w:t>
-      </w:r>
-      <w:r>
-        <w:rPr>
-          <w:rFonts w:ascii="Calibri" w:hAnsi="Calibri"/>
-          <w:color w:val="1E293B"/>
-          <w:sz w:val="19"/>
-        </w:rPr>
-        <w:t xml:space="preserve"> of the February 28, 2026 airstrike on the Shajareh Tayyebeh Girls' Elementary School;</w:t>
+        <w:t>(i) Establish a court-ready factual determination of the February 28, 2026 airstrike on the Shajareh Tayyebeh Girls' Elementary School;</w:t>
       </w:r>
     </w:p>
     <w:p>
@@ -1712,7 +1678,7 @@
           <w:color w:val="1E293B"/>
           <w:sz w:val="19"/>
         </w:rPr>
-        <w:t>(ii) To apply the ICTY OTP targeting jurisprudence (</w:t>
+        <w:t>(ii) Apply the ICTY OTP targeting jurisprudence (</w:t>
       </w:r>
       <w:r>
         <w:rPr>
@@ -1729,7 +1695,7 @@
           <w:color w:val="1E293B"/>
           <w:sz w:val="19"/>
         </w:rPr>
-        <w:t>) to demonstrate that the strike was the product of systemic peacetime targeting negligence;</w:t>
+        <w:t>) to demonstrate that peacetime targeting negligence caused the strike;</w:t>
       </w:r>
     </w:p>
     <w:p>
@@ -1744,24 +1710,7 @@
           <w:color w:val="1E293B"/>
           <w:sz w:val="19"/>
         </w:rPr>
-        <w:t xml:space="preserve">(iii) To articulate the comprehensive </w:t>
-      </w:r>
-      <w:r>
-        <w:rPr>
-          <w:rFonts w:ascii="Calibri" w:hAnsi="Calibri"/>
-          <w:b/>
-          <w:color w:val="1E293B"/>
-          <w:sz w:val="19"/>
-        </w:rPr>
-        <w:t>State Responsibility</w:t>
-      </w:r>
-      <w:r>
-        <w:rPr>
-          <w:rFonts w:ascii="Calibri" w:hAnsi="Calibri"/>
-          <w:color w:val="1E293B"/>
-          <w:sz w:val="19"/>
-        </w:rPr>
-        <w:t xml:space="preserve"> of the United States under customary international law and the ILC ARSIWA framework; and</w:t>
+        <w:t>(iii) Detail the State Responsibility of the United States under customary international law and the ILC ARSIWA framework; and</w:t>
       </w:r>
     </w:p>
     <w:p>
@@ -1776,7 +1725,7 @@
           <w:color w:val="1E293B"/>
           <w:sz w:val="19"/>
         </w:rPr>
-        <w:t>(iv) To deposit verified physical, biometric, and digital evidence into secure European custody, establishing a foundation for state-level reparations and contingent universal jurisdiction proceedings (</w:t>
+        <w:t>(iv) Deposit verified physical, biometric, and digital evidence into secure European custody to support state reparations and universal jurisdiction proceedings (</w:t>
       </w:r>
       <w:r>
         <w:rPr>
@@ -4086,7 +4035,7 @@
           <w:color w:val="1E293B"/>
           <w:sz w:val="19"/>
         </w:rPr>
-        <w:t xml:space="preserve">Crucially, the law of international armed conflict establishes an explicit, mandatory presumption in </w:t>
+        <w:t xml:space="preserve">The law of international armed conflict establishes an explicit presumption in </w:t>
       </w:r>
       <w:r>
         <w:rPr>
@@ -4451,7 +4400,7 @@
           <w:color w:val="1E293B"/>
           <w:sz w:val="19"/>
         </w:rPr>
-        <w:t>The nearest military structure inside the active naval base—a single-story logistics auxiliary storage building (</w:t>
+        <w:t>The nearest military structure inside the active naval base, a single-story logistics auxiliary storage building (</w:t>
       </w:r>
       <w:r>
         <w:rPr>
@@ -4467,7 +4416,7 @@
           <w:color w:val="1E293B"/>
           <w:sz w:val="19"/>
         </w:rPr>
-        <w:t xml:space="preserve">)—was situated </w:t>
+        <w:t xml:space="preserve">), stood </w:t>
       </w:r>
       <w:r>
         <w:rPr>
@@ -5528,7 +5477,7 @@
           <w:color w:val="1E293B"/>
           <w:sz w:val="19"/>
         </w:rPr>
-        <w:t>Military defendants frequently attempt to justify targeting misidentifications by invoking the "fog of war"—the informational deficits, time urgency, and extreme cognitive stress of dynamic combat.</w:t>
+        <w:t>Military authorities frequently attempt to justify targeting misidentifications by invoking the "fog of war," citing informational deficits, time urgency, and cognitive stress during dynamic combat.</w:t>
       </w:r>
     </w:p>
     <w:p>
@@ -6262,7 +6211,7 @@
           <w:color w:val="1E293B"/>
           <w:sz w:val="19"/>
         </w:rPr>
-        <w:t xml:space="preserve">Launching a weapon with optical terminal matching and failing to abort the strike upon encountering an obvious educational facility demonstrates </w:t>
+        <w:t xml:space="preserve">Launching a weapon with optical terminal matching and failing to abort upon encountering an obvious educational facility demonstrates </w:t>
       </w:r>
       <w:r>
         <w:rPr>
@@ -6279,7 +6228,7 @@
           <w:color w:val="1E293B"/>
           <w:sz w:val="19"/>
         </w:rPr>
-        <w:t>—reconciling oneself to the destruction of an active civilian facility.</w:t>
+        <w:t>, where operators reconcile themselves to destroying an active civilian facility.</w:t>
       </w:r>
     </w:p>
     <w:p>
@@ -6448,7 +6397,7 @@
           <w:color w:val="1E293B"/>
           <w:sz w:val="19"/>
         </w:rPr>
-        <w:t xml:space="preserve">The Principle of Distinction is the foundational cornerstone of IHL. Under </w:t>
+        <w:t xml:space="preserve">Under </w:t>
       </w:r>
       <w:r>
         <w:rPr>
@@ -6501,7 +6450,7 @@
           <w:color w:val="1E293B"/>
           <w:sz w:val="19"/>
         </w:rPr>
-        <w:t>Directing three precision-guided cruise missiles against an active girls' elementary school constitutes a direct violation of the Principle of Distinction. Because the school made zero contribution to military action, directing kinetic force against it was inherently unlawful.</w:t>
+        <w:t>Directing three precision-guided cruise missiles against an active girls' elementary school violates the Principle of Distinction. Because the school made zero contribution to military action, directing kinetic force against it was unlawful.</w:t>
       </w:r>
     </w:p>
     <w:p>
@@ -6681,7 +6630,7 @@
           <w:color w:val="1E293B"/>
           <w:sz w:val="19"/>
         </w:rPr>
-        <w:t>Even if CENTCOM intended to strike the adjacent storage building 42 meters away, the strike was fundamentally disproportionate.</w:t>
+        <w:t>Even if CENTCOM intended to strike the adjacent storage building 42 meters away, the strike violated the principle of proportionality.</w:t>
       </w:r>
     </w:p>
     <w:p>
@@ -8030,7 +7979,7 @@
           <w:color w:val="1E293B"/>
           <w:sz w:val="19"/>
         </w:rPr>
-        <w:t xml:space="preserve">—where the United States accepted full responsibility, apologized, and paid </w:t>
+        <w:t xml:space="preserve">, in which the United States accepted responsibility, apologized, and paid </w:t>
       </w:r>
       <w:r>
         <w:rPr>
@@ -8047,7 +7996,7 @@
           <w:color w:val="1E293B"/>
           <w:sz w:val="19"/>
         </w:rPr>
-        <w:t xml:space="preserve"> in direct state and victim restitution—the Panel demands that the United States execute the following remedial obligations under ILC ARSIWA Articles 30–37:</w:t>
+        <w:t xml:space="preserve"> in direct state and victim restitution, the Panel demands that the United States execute the following remedial obligations under ILC ARSIWA Articles 30–37:</w:t>
       </w:r>
     </w:p>
     <w:p>

</xml_diff>